<commit_message>
various typo fixes in .doc
</commit_message>
<xml_diff>
--- a/Discussion 3.docx
+++ b/Discussion 3.docx
@@ -264,7 +264,7 @@
           <w:szCs w:val="20"/>
           <w:rtl w:val="0"/>
         </w:rPr>
-        <w:t xml:space="preserve">Arrays and ArrayLists are similar, with the significant distinction being the dynamic nature of their length. With Arrays, the length is static, whereas in Arraylists the stack can be pushed, popped, or shifted (as referred to in some languages), resulting in a dynamic length. There are advantages to using one over the other.</w:t>
+        <w:t xml:space="preserve">Arrays and ArrayLists are similar, with the significant distinction being their dynamic length. With Arrays, the length is static, whereas in ArrayLists, the stack can be pushed, popped, or shifted (as referred to in some languages), resulting in a dynamic length. There are advantages to using one over the other.</w:t>
       </w:r>
     </w:p>
     <w:p>
@@ -1638,7 +1638,7 @@
           <w:szCs w:val="20"/>
           <w:rtl w:val="0"/>
         </w:rPr>
-        <w:t xml:space="preserve">By contrast with the Arraylist, in the GPA Converted problem we had, I wanted to track if any value entered was an “bad value. Good values would be things like A, A-, B+, B, etc. Since I didn’t want just to output a bunch of looped responses for each error, but rather summarize it, I used two Arraylists to track the invalid indices and the value of the bad entries.</w:t>
+        <w:t xml:space="preserve">By contrast with the ArrayList, in the GPA Converted problem we had, I wanted to track if any value entered was a “bad value. Good values would be things like A, A-, B+, B, etc. Since I didn’t want just to output a bunch of looped responses for each error, but rather summarize it, I used two Arraylists to track the invalid indices and the value of the bad entries.</w:t>
         <w:br w:type="textWrapping"/>
       </w:r>
     </w:p>
@@ -3441,7 +3441,7 @@
           <w:szCs w:val="20"/>
           <w:rtl w:val="0"/>
         </w:rPr>
-        <w:t xml:space="preserve">On line 1-2, I declared the Arraylists I would use to accumulate the data about the possible bad entries. On like 4-5 I ask for input and begin scanning, then on line 6, trim the input, split the string by spaces, and store it all into an array (with a max length of 13 values)</w:t>
+        <w:t xml:space="preserve">On lines 1-2, I declared the ArrayLists I would use to accumulate the data about the possible bad entries. On like 4-5, I ask for input and begin scanning, then on line 6, trim the input, split the string by spaces, and store it all into an array (with a max length of 13 values)</w:t>
       </w:r>
     </w:p>
     <w:p>

</xml_diff>